<commit_message>
add answer sheet and files ex2 lab06
</commit_message>
<xml_diff>
--- a/lab/lab06/Answer_sheet.docx
+++ b/lab/lab06/Answer_sheet.docx
@@ -114,6 +114,16 @@
         </w:rPr>
         <w:t xml:space="preserve"> </w:t>
       </w:r>
+      <w:r>
+        <w:rPr>
+          <w:rFonts w:ascii="Times New Roman" w:hAnsi="Times New Roman" w:cs="Times New Roman"/>
+          <w:b/>
+          <w:bCs/>
+          <w:sz w:val="32"/>
+          <w:szCs w:val="32"/>
+        </w:rPr>
+        <w:t>L01</w:t>
+      </w:r>
     </w:p>
     <w:p>
       <w:pPr>
@@ -153,11 +163,31 @@
           <w:szCs w:val="32"/>
         </w:rPr>
       </w:pPr>
+      <w:hyperlink r:id="rId5" w:history="1">
+        <w:r>
+          <w:rPr>
+            <w:rStyle w:val="Hyperlink"/>
+            <w:rFonts w:ascii="Times New Roman" w:hAnsi="Times New Roman" w:cs="Times New Roman"/>
+            <w:sz w:val="32"/>
+            <w:szCs w:val="32"/>
+          </w:rPr>
+          <w:t>https://github.com/Daftox/ensf381-w26</w:t>
+        </w:r>
+      </w:hyperlink>
     </w:p>
     <w:p>
       <w:pPr>
         <w:rPr>
           <w:rFonts w:ascii="Times New Roman" w:hAnsi="Times New Roman" w:cs="Times New Roman"/>
+          <w:sz w:val="32"/>
+          <w:szCs w:val="32"/>
+        </w:rPr>
+      </w:pPr>
+    </w:p>
+    <w:p>
+      <w:pPr>
+        <w:rPr>
+          <w:rFonts w:ascii="Times New Roman" w:hAnsi="Times New Roman" w:cs="Times New Roman"/>
           <w:b/>
           <w:bCs/>
           <w:sz w:val="28"/>
@@ -172,7 +202,27 @@
           <w:sz w:val="28"/>
           <w:szCs w:val="28"/>
         </w:rPr>
-        <w:t>Group information:</w:t>
+        <w:t>Group</w:t>
+      </w:r>
+      <w:r>
+        <w:rPr>
+          <w:rFonts w:ascii="Times New Roman" w:hAnsi="Times New Roman" w:cs="Times New Roman"/>
+          <w:b/>
+          <w:bCs/>
+          <w:sz w:val="28"/>
+          <w:szCs w:val="28"/>
+        </w:rPr>
+        <w:t xml:space="preserve"> 26</w:t>
+      </w:r>
+      <w:r>
+        <w:rPr>
+          <w:rFonts w:ascii="Times New Roman" w:hAnsi="Times New Roman" w:cs="Times New Roman"/>
+          <w:b/>
+          <w:bCs/>
+          <w:sz w:val="28"/>
+          <w:szCs w:val="28"/>
+        </w:rPr>
+        <w:t xml:space="preserve"> information:</w:t>
       </w:r>
     </w:p>
     <w:p>
@@ -185,23 +235,17 @@
         <w:rPr>
           <w:rFonts w:ascii="Times New Roman" w:hAnsi="Times New Roman" w:cs="Times New Roman"/>
         </w:rPr>
-        <w:t>Name 1 (UCID#)</w:t>
+        <w:t xml:space="preserve">Timothée Chuat UCID 30301255 </w:t>
       </w:r>
     </w:p>
     <w:p>
-      <w:pPr>
-        <w:rPr>
-          <w:rFonts w:ascii="Times New Roman" w:hAnsi="Times New Roman" w:cs="Times New Roman"/>
-        </w:rPr>
-      </w:pPr>
       <w:r>
         <w:rPr>
           <w:rFonts w:ascii="Times New Roman" w:hAnsi="Times New Roman" w:cs="Times New Roman"/>
         </w:rPr>
-        <w:t>Name 2 (UCID#)</w:t>
+        <w:t>Leo Zheng UCID 30263546</w:t>
       </w:r>
     </w:p>
-    <w:p/>
     <w:p>
       <w:pPr>
         <w:rPr>
@@ -914,7 +958,6 @@
   <w:style w:type="character" w:default="1" w:styleId="DefaultParagraphFont">
     <w:name w:val="Default Paragraph Font"/>
     <w:uiPriority w:val="1"/>
-    <w:semiHidden/>
     <w:unhideWhenUsed/>
   </w:style>
   <w:style w:type="table" w:default="1" w:styleId="TableNormal">
@@ -1227,6 +1270,29 @@
       <w:smallCaps/>
       <w:color w:val="0F4761" w:themeColor="accent1" w:themeShade="BF"/>
       <w:spacing w:val="5"/>
+    </w:rPr>
+  </w:style>
+  <w:style w:type="character" w:styleId="Hyperlink">
+    <w:name w:val="Hyperlink"/>
+    <w:basedOn w:val="DefaultParagraphFont"/>
+    <w:uiPriority w:val="99"/>
+    <w:unhideWhenUsed/>
+    <w:rsid w:val="00B10E3F"/>
+    <w:rPr>
+      <w:color w:val="467886" w:themeColor="hyperlink"/>
+      <w:u w:val="single"/>
+    </w:rPr>
+  </w:style>
+  <w:style w:type="character" w:styleId="UnresolvedMention">
+    <w:name w:val="Unresolved Mention"/>
+    <w:basedOn w:val="DefaultParagraphFont"/>
+    <w:uiPriority w:val="99"/>
+    <w:semiHidden/>
+    <w:unhideWhenUsed/>
+    <w:rsid w:val="00B10E3F"/>
+    <w:rPr>
+      <w:color w:val="605E5C"/>
+      <w:shd w:val="clear" w:color="auto" w:fill="E1DFDD"/>
     </w:rPr>
   </w:style>
 </w:styles>

</xml_diff>